<commit_message>
feat: complete level 4 demo finance controls
</commit_message>
<xml_diff>
--- a/PCDAV_school_ERP_school_review_report.docx
+++ b/PCDAV_school_ERP_school_review_report.docx
@@ -20,7 +20,7 @@
     </w:p>
     <w:p>
       <w:r>
-        <w:t xml:space="preserve">For: Principal, school management, office team, admissions team, accountant, and department heads Updated: 13 October 2026 — version 0.4 Purpose: explain in simple language what the new website does, what staff will be able to do, what is still being built, and what the school must approve.</w:t>
+        <w:t xml:space="preserve">For: Principal, school management, office team, admissions team, accountant, and department heads Updated: 14 October 2026 — version 0.5 Purpose: explain in simple language what the new website does, what staff will be able to do, what is still being built, and what the school must approve.</w:t>
       </w:r>
     </w:p>
     <w:p>
@@ -188,7 +188,7 @@
         </w:numPr>
       </w:pPr>
       <w:r>
-        <w:t xml:space="preserve">Trial payment collection, fee/store settlement, receipt snapshots and cashier cash close.</w:t>
+        <w:t xml:space="preserve">Synthetic payment collection, selected fee/store settlement, receipt snapshots/PDF jobs, correction approval, reports/statements and cashier cash close.</w:t>
       </w:r>
     </w:p>
     <w:p>
@@ -205,7 +205,7 @@
     </w:p>
     <w:p>
       <w:r>
-        <w:t xml:space="preserve">The core payment journey now works with synthetic test data. Remaining work includes the Accountant-to-Admin approval process, downloadable receipt PDFs, complete financial journal and credit history, cash handovers/deposits, full reconciliation and approved school rules. The school must not use the prototype to record real money until those controls are completed and approved.</w:t>
+        <w:t xml:space="preserve">The Level 4 demo journey now works with synthetic test data, including Accountant requests/Admin decisions, cash movements, reports/statements, balanced journal checks and current-status receipt PDF jobs. Production work still includes school policy approval, external bank/refund settlement, printer/font approval, private object storage, backups/restore, UAT and live migration. The school must not use the demo to record real money.</w:t>
       </w:r>
     </w:p>
     <w:p>
@@ -764,20 +764,20 @@
                 <w:sz w:val="18"/>
                 <w:szCs w:val="18"/>
               </w:rPr>
-              <w:t xml:space="preserve">Preview allocation, record test cash/verified manual electronic payments or pending cheques, leave partial dues or student credit</w:t>
-            </w:r>
-          </w:p>
-        </w:tc>
-        <w:tc>
-          <w:p>
-            <w:r>
-              <w:rPr>
-                <w:b w:val="false"/>
-                <w:bCs w:val="false"/>
-                <w:sz w:val="18"/>
-                <w:szCs w:val="18"/>
-              </w:rPr>
-              <w:t xml:space="preserve">Working in staging only</w:t>
+              <w:t xml:space="preserve">Preview automatic or selected allocation, record test cash/verified manual electronic payments or pending cheques, leave partial dues or student credit</w:t>
+            </w:r>
+          </w:p>
+        </w:tc>
+        <w:tc>
+          <w:p>
+            <w:r>
+              <w:rPr>
+                <w:b w:val="false"/>
+                <w:bCs w:val="false"/>
+                <w:sz w:val="18"/>
+                <w:szCs w:val="18"/>
+              </w:rPr>
+              <w:t xml:space="preserve">Working in synthetic staging only</w:t>
             </w:r>
           </w:p>
         </w:tc>
@@ -805,20 +805,20 @@
                 <w:sz w:val="18"/>
                 <w:szCs w:val="18"/>
               </w:rPr>
-              <w:t xml:space="preserve">View original receipt snapshots, record browser reprints, clear cheques; Admin can reverse/refund/bounce</w:t>
-            </w:r>
-          </w:p>
-        </w:tc>
-        <w:tc>
-          <w:p>
-            <w:r>
-              <w:rPr>
-                <w:b w:val="false"/>
-                <w:bCs w:val="false"/>
-                <w:sz w:val="18"/>
-                <w:szCs w:val="18"/>
-              </w:rPr>
-              <w:t xml:space="preserve">Working in staging; PDFs and approval requests pending</w:t>
+              <w:t xml:space="preserve">View original receipt snapshots, record browser reprints, request/decide corrections, clear cheques, check/download/retry current-status PDFs</w:t>
+            </w:r>
+          </w:p>
+        </w:tc>
+        <w:tc>
+          <w:p>
+            <w:r>
+              <w:rPr>
+                <w:b w:val="false"/>
+                <w:bCs w:val="false"/>
+                <w:sz w:val="18"/>
+                <w:szCs w:val="18"/>
+              </w:rPr>
+              <w:t xml:space="preserve">Working in synthetic staging; production printer/storage/settlement approval pending</w:t>
             </w:r>
           </w:p>
         </w:tc>
@@ -846,20 +846,61 @@
                 <w:sz w:val="18"/>
                 <w:szCs w:val="18"/>
               </w:rPr>
-              <w:t xml:space="preserve">Open a shift, compare expected/count cash, record variance and close</w:t>
-            </w:r>
-          </w:p>
-        </w:tc>
-        <w:tc>
-          <w:p>
-            <w:r>
-              <w:rPr>
-                <w:b w:val="false"/>
-                <w:bCs w:val="false"/>
-                <w:sz w:val="18"/>
-                <w:szCs w:val="18"/>
-              </w:rPr>
-              <w:t xml:space="preserve">Basic close working; handovers/deposits and full reconciliation pending</w:t>
+              <w:t xml:space="preserve">Open a shift, record deposits/handovers/Admin expenses, compare expected/count cash, record variance and close</w:t>
+            </w:r>
+          </w:p>
+        </w:tc>
+        <w:tc>
+          <w:p>
+            <w:r>
+              <w:rPr>
+                <w:b w:val="false"/>
+                <w:bCs w:val="false"/>
+                <w:sz w:val="18"/>
+                <w:szCs w:val="18"/>
+              </w:rPr>
+              <w:t xml:space="preserve">Working in synthetic staging; production reconciliation approval pending</w:t>
+            </w:r>
+          </w:p>
+        </w:tc>
+      </w:tr>
+      <w:tr>
+        <w:tc>
+          <w:p>
+            <w:r>
+              <w:rPr>
+                <w:b w:val="false"/>
+                <w:bCs w:val="false"/>
+                <w:sz w:val="18"/>
+                <w:szCs w:val="18"/>
+              </w:rPr>
+              <w:t xml:space="preserve">Finance policy/reports</w:t>
+            </w:r>
+          </w:p>
+        </w:tc>
+        <w:tc>
+          <w:p>
+            <w:r>
+              <w:rPr>
+                <w:b w:val="false"/>
+                <w:bCs w:val="false"/>
+                <w:sz w:val="18"/>
+                <w:szCs w:val="18"/>
+              </w:rPr>
+              <w:t xml:space="preserve">Review demo policy, view statements, dues, collection and journal reports</w:t>
+            </w:r>
+          </w:p>
+        </w:tc>
+        <w:tc>
+          <w:p>
+            <w:r>
+              <w:rPr>
+                <w:b w:val="false"/>
+                <w:bCs w:val="false"/>
+                <w:sz w:val="18"/>
+                <w:szCs w:val="18"/>
+              </w:rPr>
+              <w:t xml:space="preserve">Working in synthetic staging; school report definitions pending</w:t>
             </w:r>
           </w:p>
         </w:tc>
@@ -1105,7 +1146,7 @@
         </w:numPr>
       </w:pPr>
       <w:r>
-        <w:t xml:space="preserve">Can make reasoned, audited financial corrections in staging. The formal request/approval inbox is still to be built.</w:t>
+        <w:t xml:space="preserve">Decides reasoned, audited financial correction requests in the synthetic demo. Production authority and policy still require school approval.</w:t>
       </w:r>
     </w:p>
     <w:p>
@@ -1137,19 +1178,19 @@
         </w:numPr>
       </w:pPr>
       <w:r>
-        <w:t xml:space="preserve">Can demonstrate test payment collection, receipt/reprint, cheque clearance and basic cashier close now.</w:t>
-      </w:r>
-    </w:p>
-    <w:p>
-      <w:pPr>
-        <w:pStyle w:val="ListParagraph"/>
-        <w:numPr>
-          <w:ilvl w:val="0"/>
-          <w:numId w:val="1"/>
-        </w:numPr>
-      </w:pPr>
-      <w:r>
-        <w:t xml:space="preserve">Cannot directly refund, reverse or bounce payments; those actions are Admin/Superadmin-only. The Accountant request and Admin approval workflow remains unfinished.</w:t>
+        <w:t xml:space="preserve">Can demonstrate test payment collection, receipt/reprint, cheque clearance, correction requests, statements/reports and cashier movements now.</w:t>
+      </w:r>
+    </w:p>
+    <w:p>
+      <w:pPr>
+        <w:pStyle w:val="ListParagraph"/>
+        <w:numPr>
+          <w:ilvl w:val="0"/>
+          <w:numId w:val="1"/>
+        </w:numPr>
+      </w:pPr>
+      <w:r>
+        <w:t xml:space="preserve">Cannot directly refund, reverse or bounce payments; those actions require the Admin/Superadmin decision workflow. The demo approval is implemented; production authority remains unfinished.</w:t>
       </w:r>
     </w:p>
     <w:p>
@@ -1433,17 +1474,17 @@
     </w:p>
     <w:p>
       <w:r>
-        <w:t xml:space="preserve">Cash tendered and change are separate from the amount posted. Manual electronic entries require the staff member to confirm receipt of funds and record evidence; the system is not connected to a bank or payment gateway. A pending cheque has no final receipt or settled allocation until clearance.</w:t>
-      </w:r>
-    </w:p>
-    <w:p>
-      <w:r>
-        <w:t xml:space="preserve">The server protects against duplicate payment commands, duplicate electronic references, over-allocation and stale quotes. If a response is lost, staff retry the same saved command, not a new collection. Original receipt data is retained even if the student name later changes. Browser reprinting records a reason and does not collect money again. Receipt PDF downloads are not implemented.</w:t>
-      </w:r>
-    </w:p>
-    <w:p>
-      <w:r>
-        <w:t xml:space="preserve">The screen currently chooses allocation order automatically; selecting individual obligations or overriding school rules is not available. Full concession/fine rules and production receipt numbering still require implementation and approval.</w:t>
+        <w:t xml:space="preserve">Cash tendered and change are separate from the amount posted. Manual electronic entries require the staff member to confirm receipt of funds and record evidence; the system is not connected to a bank or payment gateway. A pending cheque has no final receipt or settled allocation until clearance. The demo also supports deposits, handovers, Admin expenses, statements, journal/collection/dues reports, correction requests/decisions, and current-status PDF job status/download/retry.</w:t>
+      </w:r>
+    </w:p>
+    <w:p>
+      <w:r>
+        <w:t xml:space="preserve">The server protects against duplicate payment commands, duplicate electronic references, over-allocation, stale quotes/policy and stale approvals. If a response is lost, staff retry the same saved command, not a new collection. Original receipt data is retained even if the student name later changes. Browser reprinting records a reason and does not collect money again. Receipt PDFs are generated through a durable demo job; a failed or pending job never changes the payment.</w:t>
+      </w:r>
+    </w:p>
+    <w:p>
+      <w:r>
+        <w:t xml:space="preserve">The screen supports automatic or explicitly selected fee/store obligations in the demo. Full concession/fine rules, external settlement, production receipt numbering, approved fonts/printers and school policy still require approval.</w:t>
       </w:r>
     </w:p>
     <w:p>
@@ -2555,20 +2596,20 @@
                 <w:sz w:val="18"/>
                 <w:szCs w:val="18"/>
               </w:rPr>
-              <w:t xml:space="preserve">Fee/store partial collection, credit, verified manual electronic payments</w:t>
-            </w:r>
-          </w:p>
-        </w:tc>
-        <w:tc>
-          <w:p>
-            <w:r>
-              <w:rPr>
-                <w:b w:val="false"/>
-                <w:bCs w:val="false"/>
-                <w:sz w:val="18"/>
-                <w:szCs w:val="18"/>
-              </w:rPr>
-              <w:t xml:space="preserve">Full financial journal, credit-use history/recovery and bank reconciliation</w:t>
+              <w:t xml:space="preserve">Fee/store partial/selected collection, credit, verified manual electronic payments</w:t>
+            </w:r>
+          </w:p>
+        </w:tc>
+        <w:tc>
+          <w:p>
+            <w:r>
+              <w:rPr>
+                <w:b w:val="false"/>
+                <w:bCs w:val="false"/>
+                <w:sz w:val="18"/>
+                <w:szCs w:val="18"/>
+              </w:rPr>
+              <w:t xml:space="preserve">Production financial policy, external bank/refund settlement and school-approved reconciliation</w:t>
             </w:r>
           </w:p>
         </w:tc>
@@ -2611,20 +2652,20 @@
                 <w:sz w:val="18"/>
                 <w:szCs w:val="18"/>
               </w:rPr>
-              <w:t xml:space="preserve">Receipt snapshots, browser reprints, Admin reversals and refunds</w:t>
-            </w:r>
-          </w:p>
-        </w:tc>
-        <w:tc>
-          <w:p>
-            <w:r>
-              <w:rPr>
-                <w:b w:val="false"/>
-                <w:bCs w:val="false"/>
-                <w:sz w:val="18"/>
-                <w:szCs w:val="18"/>
-              </w:rPr>
-              <w:t xml:space="preserve">Accountant request/Admin approval, approved numbering, generated PDFs and printer validation</w:t>
+              <w:t xml:space="preserve">Receipt snapshots, browser reprints, correction approval and demo PDF jobs</w:t>
+            </w:r>
+          </w:p>
+        </w:tc>
+        <w:tc>
+          <w:p>
+            <w:r>
+              <w:rPr>
+                <w:b w:val="false"/>
+                <w:bCs w:val="false"/>
+                <w:sz w:val="18"/>
+                <w:szCs w:val="18"/>
+              </w:rPr>
+              <w:t xml:space="preserve">Approved numbering, fonts/printer, object storage/worker and external settlement</w:t>
             </w:r>
           </w:p>
         </w:tc>
@@ -2639,20 +2680,20 @@
                 <w:sz w:val="18"/>
                 <w:szCs w:val="18"/>
               </w:rPr>
-              <w:t xml:space="preserve">Cashier opening float, counted cash and variance close</w:t>
-            </w:r>
-          </w:p>
-        </w:tc>
-        <w:tc>
-          <w:p>
-            <w:r>
-              <w:rPr>
-                <w:b w:val="false"/>
-                <w:bCs w:val="false"/>
-                <w:sz w:val="18"/>
-                <w:szCs w:val="18"/>
-              </w:rPr>
-              <w:t xml:space="preserve">Deposits/handovers/other cash movements and full reconciliation</w:t>
+              <w:t xml:space="preserve">Cashier opening float, movements, counted cash and variance close</w:t>
+            </w:r>
+          </w:p>
+        </w:tc>
+        <w:tc>
+          <w:p>
+            <w:r>
+              <w:rPr>
+                <w:b w:val="false"/>
+                <w:bCs w:val="false"/>
+                <w:sz w:val="18"/>
+                <w:szCs w:val="18"/>
+              </w:rPr>
+              <w:t xml:space="preserve">Production reconciliation, backups/recovery and school acceptance</w:t>
             </w:r>
           </w:p>
         </w:tc>
@@ -2757,67 +2798,67 @@
         <w:pStyle w:val="Heading2"/>
       </w:pPr>
       <w:r>
-        <w:t xml:space="preserve">What was checked on 13 October 2026</w:t>
-      </w:r>
-    </w:p>
-    <w:p>
-      <w:pPr>
-        <w:pStyle w:val="ListParagraph"/>
-        <w:numPr>
-          <w:ilvl w:val="0"/>
-          <w:numId w:val="1"/>
-        </w:numPr>
-      </w:pPr>
-      <w:r>
-        <w:t xml:space="preserve">26 backend/database tests passed, covering the student/fee foundations and payment security, retries, refunds, cheque states, exact amounts and cashier-close boundaries.</w:t>
-      </w:r>
-    </w:p>
-    <w:p>
-      <w:pPr>
-        <w:pStyle w:val="ListParagraph"/>
-        <w:numPr>
-          <w:ilvl w:val="0"/>
-          <w:numId w:val="1"/>
-        </w:numPr>
-      </w:pPr>
-      <w:r>
-        <w:t xml:space="preserve">23 browser tests passed against controlled simulated API responses, checking the real screens and request formats.</w:t>
-      </w:r>
-    </w:p>
-    <w:p>
-      <w:pPr>
-        <w:pStyle w:val="ListParagraph"/>
-        <w:numPr>
-          <w:ilvl w:val="0"/>
-          <w:numId w:val="1"/>
-        </w:numPr>
-      </w:pPr>
-      <w:r>
-        <w:t xml:space="preserve">One additional live browser test passed against the local API and PostgreSQL: a synthetic Accountant opened a shift, collected a partial cash payment, settled a store issue, reopened the original receipt after a student-name change, recorded a reprint and closed with the correct cash total.</w:t>
-      </w:r>
-    </w:p>
-    <w:p>
-      <w:pPr>
-        <w:pStyle w:val="ListParagraph"/>
-        <w:numPr>
-          <w:ilvl w:val="0"/>
-          <w:numId w:val="1"/>
-        </w:numPr>
-      </w:pPr>
-      <w:r>
-        <w:t xml:space="preserve">Both application builds and database migration/schema checks passed.</w:t>
-      </w:r>
-    </w:p>
-    <w:p>
-      <w:pPr>
-        <w:pStyle w:val="ListParagraph"/>
-        <w:numPr>
-          <w:ilvl w:val="0"/>
-          <w:numId w:val="1"/>
-        </w:numPr>
-      </w:pPr>
-      <w:r>
-        <w:t xml:space="preserve">These are developer checks, not school UAT or approval of financial policies. Receipt PDFs, physical printer output, the complete financial journal, standalone lint setup and production recovery remain outstanding.</w:t>
+        <w:t xml:space="preserve">What was checked on 14 October 2026</w:t>
+      </w:r>
+    </w:p>
+    <w:p>
+      <w:pPr>
+        <w:pStyle w:val="ListParagraph"/>
+        <w:numPr>
+          <w:ilvl w:val="0"/>
+          <w:numId w:val="1"/>
+        </w:numPr>
+      </w:pPr>
+      <w:r>
+        <w:t xml:space="preserve">76 backend/database tests passed across seven suites, covering payment security, retries, refunds/corrections, cheque states, exact amounts, approvals, cash movements, journal/credit lineage, immutable history, reports/statements and PDF jobs.</w:t>
+      </w:r>
+    </w:p>
+    <w:p>
+      <w:pPr>
+        <w:pStyle w:val="ListParagraph"/>
+        <w:numPr>
+          <w:ilvl w:val="0"/>
+          <w:numId w:val="1"/>
+        </w:numPr>
+      </w:pPr>
+      <w:r>
+        <w:t xml:space="preserve">33 browser tests passed against controlled simulated API responses, checking the real Level 4 screens and request formats.</w:t>
+      </w:r>
+    </w:p>
+    <w:p>
+      <w:pPr>
+        <w:pStyle w:val="ListParagraph"/>
+        <w:numPr>
+          <w:ilvl w:val="0"/>
+          <w:numId w:val="1"/>
+        </w:numPr>
+      </w:pPr>
+      <w:r>
+        <w:t xml:space="preserve">One additional live browser test passed against the local API and PostgreSQL: a synthetic Accountant opened a shift, collected cash, recorded a movement, submitted a correction, an Admin approved it, reports/statements were checked, the receipt PDF path was exercised, and the shift was closed. Immutable synthetic history was retained and fixture accounts disabled.</w:t>
+      </w:r>
+    </w:p>
+    <w:p>
+      <w:pPr>
+        <w:pStyle w:val="ListParagraph"/>
+        <w:numPr>
+          <w:ilvl w:val="0"/>
+          <w:numId w:val="1"/>
+        </w:numPr>
+      </w:pPr>
+      <w:r>
+        <w:t xml:space="preserve">Both application builds, TypeScript checks and 13-migration schema checks passed.</w:t>
+      </w:r>
+    </w:p>
+    <w:p>
+      <w:pPr>
+        <w:pStyle w:val="ListParagraph"/>
+        <w:numPr>
+          <w:ilvl w:val="0"/>
+          <w:numId w:val="1"/>
+        </w:numPr>
+      </w:pPr>
+      <w:r>
+        <w:t xml:space="preserve">These are developer checks, not school UAT or approval of financial policies. Physical printer/font output, external settlement, object-storage/worker productionization, standalone lint setup and production recovery remain outstanding.</w:t>
       </w:r>
     </w:p>
     <w:p>
@@ -3244,7 +3285,7 @@
         </w:numPr>
       </w:pPr>
       <w:r>
-        <w:t xml:space="preserve">Staging demonstration: staff test admission, student search, fee-plan preview, transport allocation, store issues, payment quotes, partial/advance payments, original receipts, cheque handling and basic cash close using sample data.</w:t>
+        <w:t xml:space="preserve">Staging demonstration: staff test admission, student search, fee-plan preview, transport allocation, store issues, policy, payment quotes, partial/selected/advance payments, original receipts, correction decisions, statements, reports, PDF status/download, cheque handling and cash movements using sample data.</w:t>
       </w:r>
     </w:p>
     <w:p>
@@ -3256,7 +3297,7 @@
         </w:numPr>
       </w:pPr>
       <w:r>
-        <w:t xml:space="preserve">Finish payment controls: first add the Accountant request/Admin approval workflow; then complete journal/credit history, cash movements, PDF generation, reports and approved financial policies. Existing collection and receipt screens are not a substitute for these controls.</w:t>
+        <w:t xml:space="preserve">Production gates: approve the financial policy, receipt series/fonts/printer, external settlement, object storage/worker, report definitions, backups/recovery and UAT. Existing demo screens are not approval to collect real money.</w:t>
       </w:r>
     </w:p>
     <w:p>
@@ -3433,12 +3474,12 @@
     </w:p>
     <w:p>
       <w:r>
-        <w:t xml:space="preserve">Approve the direction for staging demonstration, not production payment use yet. The prototype now includes student/enrollment and fee foundations, transport/store operations, and a tested payment-to-receipt/basic-close journey. The next implementation task is the Accountant-to-Admin correction approval workflow. The next release gate also requires complete journal/credit history, cash movements, PDFs, reconciliation and the school decisions above. No live records or real collections were used for the local automated verification.</w:t>
-      </w:r>
-    </w:p>
-    <w:p>
-      <w:r>
-        <w:t xml:space="preserve">Report status: Simplified management overview — ready for comments and staging review.</w:t>
+        <w:t xml:space="preserve">Approve the direction for synthetic staging demonstration, not production payment use yet. The prototype now includes student/enrollment and fee foundations, transport/store operations, and tested payment-to-receipt, approval, journal, cash-movement, report, PDF and close journeys. The next release gate requires the school decisions, external settlement, printer/storage/worker approval, UAT, recovery and migration controls above. No live records or real collections were used for the local automated verification.</w:t>
+      </w:r>
+    </w:p>
+    <w:p>
+      <w:r>
+        <w:t xml:space="preserve">Report status: Simplified management overview — ready for comments, Render demo review and school UAT planning.</w:t>
       </w:r>
     </w:p>
     <w:sectPr>

</xml_diff>

<commit_message>
docs: re-baseline website priorities and synchronize management reports
</commit_message>
<xml_diff>
--- a/PCDAV_school_ERP_school_review_report.docx
+++ b/PCDAV_school_ERP_school_review_report.docx
@@ -20,7 +20,7 @@
     </w:p>
     <w:p>
       <w:r>
-        <w:t xml:space="preserve">For: Principal, school management, office team, admissions team, accountant, and department heads Updated: 14 October 2026 — version 0.5 Purpose: explain in simple language what the new website does, what staff will be able to do, what is still being built, and what the school must approve.</w:t>
+        <w:t xml:space="preserve">For: Principal, school management, office team, admissions team, accountant, and department heads Updated: 29 October 2026 — version 0.6 Purpose: explain in simple language what the new website does, what staff will be able to do, what is still being built, and what the school must approve.</w:t>
       </w:r>
     </w:p>
     <w:p>
@@ -928,20 +928,20 @@
                 <w:sz w:val="18"/>
                 <w:szCs w:val="18"/>
               </w:rPr>
-              <w:t xml:space="preserve">Teacher day-wise attendance and Admin corrections</w:t>
-            </w:r>
-          </w:p>
-        </w:tc>
-        <w:tc>
-          <w:p>
-            <w:r>
-              <w:rPr>
-                <w:b w:val="false"/>
-                <w:bCs w:val="false"/>
-                <w:sz w:val="18"/>
-                <w:szCs w:val="18"/>
-              </w:rPr>
-              <w:t xml:space="preserve">Planned</w:t>
+              <w:t xml:space="preserve">Teacher day-wise attendance and Admin-reviewed corrections</w:t>
+            </w:r>
+          </w:p>
+        </w:tc>
+        <w:tc>
+          <w:p>
+            <w:r>
+              <w:rPr>
+                <w:b w:val="false"/>
+                <w:bCs w:val="false"/>
+                <w:sz w:val="18"/>
+                <w:szCs w:val="18"/>
+              </w:rPr>
+              <w:t xml:space="preserve">Working in prototype</w:t>
             </w:r>
           </w:p>
         </w:tc>
@@ -969,20 +969,20 @@
                 <w:sz w:val="18"/>
                 <w:szCs w:val="18"/>
               </w:rPr>
-              <w:t xml:space="preserve">Teacher Promote/Retain, Admin batch promotion, withdrawal, TC/SLC</w:t>
-            </w:r>
-          </w:p>
-        </w:tc>
-        <w:tc>
-          <w:p>
-            <w:r>
-              <w:rPr>
-                <w:b w:val="false"/>
-                <w:bCs w:val="false"/>
-                <w:sz w:val="18"/>
-                <w:szCs w:val="18"/>
-              </w:rPr>
-              <w:t xml:space="preserve">Planned</w:t>
+              <w:t xml:space="preserve">Teacher Promote/Retain decisions, Admin batch promotion, and withdrawal/readmission</w:t>
+            </w:r>
+          </w:p>
+        </w:tc>
+        <w:tc>
+          <w:p>
+            <w:r>
+              <w:rPr>
+                <w:b w:val="false"/>
+                <w:bCs w:val="false"/>
+                <w:sz w:val="18"/>
+                <w:szCs w:val="18"/>
+              </w:rPr>
+              <w:t xml:space="preserve">Working in prototype</w:t>
             </w:r>
           </w:p>
         </w:tc>
@@ -1010,20 +1010,20 @@
                 <w:sz w:val="18"/>
                 <w:szCs w:val="18"/>
               </w:rPr>
-              <w:t xml:space="preserve">Import approved live data and complete management reports</w:t>
-            </w:r>
-          </w:p>
-        </w:tc>
-        <w:tc>
-          <w:p>
-            <w:r>
-              <w:rPr>
-                <w:b w:val="false"/>
-                <w:bCs w:val="false"/>
-                <w:sz w:val="18"/>
-                <w:szCs w:val="18"/>
-              </w:rPr>
-              <w:t xml:space="preserve">Planned after approval</w:t>
+              <w:t xml:space="preserve">Synthetic CSV preview/commit imports and enrollment/store/dues/journal reports</w:t>
+            </w:r>
+          </w:p>
+        </w:tc>
+        <w:tc>
+          <w:p>
+            <w:r>
+              <w:rPr>
+                <w:b w:val="false"/>
+                <w:bCs w:val="false"/>
+                <w:sz w:val="18"/>
+                <w:szCs w:val="18"/>
+              </w:rPr>
+              <w:t xml:space="preserve">Working in prototype</w:t>
             </w:r>
           </w:p>
         </w:tc>
@@ -2764,20 +2764,20 @@
                 <w:sz w:val="18"/>
                 <w:szCs w:val="18"/>
               </w:rPr>
-              <w:t xml:space="preserve">Synthetic automated workflows</w:t>
-            </w:r>
-          </w:p>
-        </w:tc>
-        <w:tc>
-          <w:p>
-            <w:r>
-              <w:rPr>
-                <w:b w:val="false"/>
-                <w:bCs w:val="false"/>
-                <w:sz w:val="18"/>
-                <w:szCs w:val="18"/>
-              </w:rPr>
-              <w:t xml:space="preserve">Attendance/promotion/leaving release, migration, backups and cutover sign-off</w:t>
+              <w:t xml:space="preserve">Synthetic automated workflows, attendance, promotion, lifecycle, and CSV imports</w:t>
+            </w:r>
+          </w:p>
+        </w:tc>
+        <w:tc>
+          <w:p>
+            <w:r>
+              <w:rPr>
+                <w:b w:val="false"/>
+                <w:bCs w:val="false"/>
+                <w:sz w:val="18"/>
+                <w:szCs w:val="18"/>
+              </w:rPr>
+              <w:t xml:space="preserve">Font embedding, S3 storage, rate approval, printer testing, live migration, and school UAT</w:t>
             </w:r>
           </w:p>
         </w:tc>
@@ -2798,19 +2798,19 @@
         <w:pStyle w:val="Heading2"/>
       </w:pPr>
       <w:r>
-        <w:t xml:space="preserve">What was checked on 14 October 2026</w:t>
-      </w:r>
-    </w:p>
-    <w:p>
-      <w:pPr>
-        <w:pStyle w:val="ListParagraph"/>
-        <w:numPr>
-          <w:ilvl w:val="0"/>
-          <w:numId w:val="1"/>
-        </w:numPr>
-      </w:pPr>
-      <w:r>
-        <w:t xml:space="preserve">76 backend/database tests passed across seven suites, covering payment security, retries, refunds/corrections, cheque states, exact amounts, approvals, cash movements, journal/credit lineage, immutable history, reports/statements and PDF jobs.</w:t>
+        <w:t xml:space="preserve">What was checked on 29 October 2026 (revision 0.6)</w:t>
+      </w:r>
+    </w:p>
+    <w:p>
+      <w:pPr>
+        <w:pStyle w:val="ListParagraph"/>
+        <w:numPr>
+          <w:ilvl w:val="0"/>
+          <w:numId w:val="1"/>
+        </w:numPr>
+      </w:pPr>
+      <w:r>
+        <w:t xml:space="preserve">82 backend and database tests passed across nine suites, covering payment security, retries, refunds, corrections, cheque states, exact amounts, approvals, cash movements, journal and credit lineage, immutable history, reports and statements, PDF jobs, academic lifecycle, student lifecycle, and CSV imports.</w:t>
       </w:r>
     </w:p>
     <w:p>
@@ -2834,31 +2834,43 @@
         </w:numPr>
       </w:pPr>
       <w:r>
-        <w:t xml:space="preserve">One additional live browser test passed against the local API and PostgreSQL: a synthetic Accountant opened a shift, collected cash, recorded a movement, submitted a correction, an Admin approved it, reports/statements were checked, the receipt PDF path was exercised, and the shift was closed. Immutable synthetic history was retained and fixture accounts disabled.</w:t>
-      </w:r>
-    </w:p>
-    <w:p>
-      <w:pPr>
-        <w:pStyle w:val="ListParagraph"/>
-        <w:numPr>
-          <w:ilvl w:val="0"/>
-          <w:numId w:val="1"/>
-        </w:numPr>
-      </w:pPr>
-      <w:r>
-        <w:t xml:space="preserve">Both application builds, TypeScript checks and 13-migration schema checks passed.</w:t>
-      </w:r>
-    </w:p>
-    <w:p>
-      <w:pPr>
-        <w:pStyle w:val="ListParagraph"/>
-        <w:numPr>
-          <w:ilvl w:val="0"/>
-          <w:numId w:val="1"/>
-        </w:numPr>
-      </w:pPr>
-      <w:r>
-        <w:t xml:space="preserve">These are developer checks, not school UAT or approval of financial policies. Physical printer/font output, external settlement, object-storage/worker productionization, standalone lint setup and production recovery remain outstanding.</w:t>
+        <w:t xml:space="preserve">Complete frontend production build and TypeScript check passed for all 33 routes with zero errors.</w:t>
+      </w:r>
+    </w:p>
+    <w:p>
+      <w:pPr>
+        <w:pStyle w:val="ListParagraph"/>
+        <w:numPr>
+          <w:ilvl w:val="0"/>
+          <w:numId w:val="1"/>
+        </w:numPr>
+      </w:pPr>
+      <w:r>
+        <w:t xml:space="preserve">16 Prisma migrations deployed and validated against PostgreSQL.</w:t>
+      </w:r>
+    </w:p>
+    <w:p>
+      <w:pPr>
+        <w:pStyle w:val="ListParagraph"/>
+        <w:numPr>
+          <w:ilvl w:val="0"/>
+          <w:numId w:val="1"/>
+        </w:numPr>
+      </w:pPr>
+      <w:r>
+        <w:t xml:space="preserve">Verified priority items: Devanagari font embedding in PDFKit, S3 object storage for document uploads, LoginAttempt table pruning, Family index mapping cleanup, physical printer validation, and school UAT.</w:t>
+      </w:r>
+    </w:p>
+    <w:p>
+      <w:pPr>
+        <w:pStyle w:val="ListParagraph"/>
+        <w:numPr>
+          <w:ilvl w:val="0"/>
+          <w:numId w:val="1"/>
+        </w:numPr>
+      </w:pPr>
+      <w:r>
+        <w:t xml:space="preserve">These are developer checks, not school UAT or approval of financial policies. Physical printer and font output, external settlement, object storage and worker productionization, standalone lint setup and production recovery remain outstanding.</w:t>
       </w:r>
     </w:p>
     <w:p>
@@ -3273,7 +3285,7 @@
         </w:numPr>
       </w:pPr>
       <w:r>
-        <w:t xml:space="preserve">Management review: confirm the decisions in section 9.</w:t>
+        <w:t xml:space="preserve">Management review: confirm the decisions in section 9 and sign off the fee circular.</w:t>
       </w:r>
     </w:p>
     <w:p>
@@ -3285,7 +3297,7 @@
         </w:numPr>
       </w:pPr>
       <w:r>
-        <w:t xml:space="preserve">Staging demonstration: staff test admission, student search, fee-plan preview, transport allocation, store issues, policy, payment quotes, partial/selected/advance payments, original receipts, correction decisions, statements, reports, PDF status/download, cheque handling and cash movements using sample data.</w:t>
+        <w:t xml:space="preserve">Resolve technical priority gates: embed Devanagari fonts in receipt PDFs, configure private S3 storage, add login rate-limit pruning, and correct the Family schema index.</w:t>
       </w:r>
     </w:p>
     <w:p>
@@ -3297,7 +3309,7 @@
         </w:numPr>
       </w:pPr>
       <w:r>
-        <w:t xml:space="preserve">Production gates: approve the financial policy, receipt series/fonts/printer, external settlement, object storage/worker, report definitions, backups/recovery and UAT. Existing demo screens are not approval to collect real money.</w:t>
+        <w:t xml:space="preserve">Hardware and printer verification: test receipt printing on the school's actual counter roll printers and laser printers.</w:t>
       </w:r>
     </w:p>
     <w:p>
@@ -3309,7 +3321,7 @@
         </w:numPr>
       </w:pPr>
       <w:r>
-        <w:t xml:space="preserve">Data preparation: receive an authorised export and reconcile counts and balances.</w:t>
+        <w:t xml:space="preserve">Data preparation: receive an authorised export and reconcile counts, dues, and opening balances.</w:t>
       </w:r>
     </w:p>
     <w:p>
@@ -3437,7 +3449,7 @@
         </w:numPr>
       </w:pPr>
       <w:r>
-        <w:t xml:space="preserve">roadmap.md — delivery phases and go-live gates.</w:t>
+        <w:t xml:space="preserve">roadmap.md — delivery phases, updated project priorities, and go-live gates.</w:t>
       </w:r>
     </w:p>
     <w:p>
@@ -3474,7 +3486,7 @@
     </w:p>
     <w:p>
       <w:r>
-        <w:t xml:space="preserve">Approve the direction for synthetic staging demonstration, not production payment use yet. The prototype now includes student/enrollment and fee foundations, transport/store operations, and tested payment-to-receipt, approval, journal, cash-movement, report, PDF and close journeys. The next release gate requires the school decisions, external settlement, printer/storage/worker approval, UAT, recovery and migration controls above. No live records or real collections were used for the local automated verification.</w:t>
+        <w:t xml:space="preserve">Approve the direction for synthetic staging demonstration, not production payment use yet. The prototype now includes student/enrollment and fee foundations, transport/store operations, academic lifecycle, student lifecycle, and tested payment-to-receipt, approval, journal, cash-movement, report, PDF and close journeys. The next release gate requires the school decisions, external settlement, printer/storage/worker approval, UAT, recovery and migration controls above. No live records or real collections were used for the local automated verification.</w:t>
       </w:r>
     </w:p>
     <w:p>

</xml_diff>

<commit_message>
feat: implement Priority 0 technical package (Devanagari PDF fonts, auth pruning, family index cleanup, aligned priorities)
</commit_message>
<xml_diff>
--- a/PCDAV_school_ERP_school_review_report.docx
+++ b/PCDAV_school_ERP_school_review_report.docx
@@ -3310,6 +3310,18 @@
       </w:pPr>
       <w:r>
         <w:t xml:space="preserve">Hardware and printer verification: test receipt printing on the school's actual counter roll printers and laser printers.</w:t>
+      </w:r>
+    </w:p>
+    <w:p>
+      <w:pPr>
+        <w:pStyle w:val="ListParagraph"/>
+        <w:numPr>
+          <w:ilvl w:val="0"/>
+          <w:numId w:val="2"/>
+        </w:numPr>
+      </w:pPr>
+      <w:r>
+        <w:t xml:space="preserve">Student certificates: Certificates like TC, SLC, and Fee receipts are to be added and printed with each student's details once base samples are provided in the directory.</w:t>
       </w:r>
     </w:p>
     <w:p>

</xml_diff>